<commit_message>
Added a few changes to the proposal and the weekly action plan
</commit_message>
<xml_diff>
--- a/HepatoTwin-Proposal (5).docx
+++ b/HepatoTwin-Proposal (5).docx
@@ -192,7 +192,7 @@
           <w:rFonts w:ascii="Times New Roman" w:cs="Times New Roman" w:eastAsia="Times New Roman" w:hAnsi="Times New Roman"/>
           <w:rtl w:val="0"/>
         </w:rPr>
-        <w:t xml:space="preserve">Clinical focus: metabolic dysfunction-associated steatotic liver disease (MASLD; formerly NAFLD) — diet-modifiable, with strong clinical evidence linking dietary and weight changes to measurable outcomes, giving the project a concrete, gradable success criterion. This is stated as a focus, not baked into the title, because the underlying framework — the twin's state model and its recipe evaluation and ranking engine — is domain-general and could be re-validated against any diet-modifiable condition DietRx/SpiceRx already cover.</w:t>
+        <w:t>Clinical focus: metabolic dysfunction-associated steatotic liver disease (MASLD; formerly NAFLD) — diet-modifiable, with strong clinical evidence linking dietary and weight changes to measurable outcomes, giving the project a concrete, gradable success criterion. This is stated as a focus, not baked into the title, because the underlying framework — the twin's state model and its recipe evaluation and ranking engine — is domain-general and could be re-validated against any diet-modifiable condition with a comparable evidence base.</w:t>
       </w:r>
     </w:p>
     <w:p>
@@ -947,7 +947,7 @@
                 <w:szCs w:val="17"/>
                 <w:rtl w:val="0"/>
               </w:rPr>
-              <w:t xml:space="preserve">Clinical trials/meta-analyses, DietRx/SpiceRx associations, causal-graph gating</w:t>
+              <w:t>Clinical trials/meta-analyses, causal-graph gating</w:t>
             </w:r>
           </w:p>
         </w:tc>
@@ -1771,85 +1771,6 @@
       <w:tr>
         <w:trPr>
           <w:cantSplit w:val="0"/>
-          <w:trHeight w:val="615" w:hRule="atLeast"/>
-          <w:tblHeader w:val="0"/>
-        </w:trPr>
-        <w:tc>
-          <w:tcPr>
-            <w:tcBorders>
-              <w:top w:color="000000" w:space="0" w:sz="0" w:val="nil"/>
-              <w:left w:color="b7b7b7" w:space="0" w:sz="5" w:val="single"/>
-              <w:bottom w:color="b7b7b7" w:space="0" w:sz="5" w:val="single"/>
-              <w:right w:color="b7b7b7" w:space="0" w:sz="5" w:val="single"/>
-            </w:tcBorders>
-            <w:tcMar>
-              <w:top w:w="80.0" w:type="dxa"/>
-              <w:left w:w="120.0" w:type="dxa"/>
-              <w:bottom w:w="80.0" w:type="dxa"/>
-              <w:right w:w="120.0" w:type="dxa"/>
-            </w:tcMar>
-            <w:vAlign w:val="top"/>
-          </w:tcPr>
-          <w:p>
-            <w:pPr>
-              <w:spacing w:after="40" w:lineRule="auto"/>
-              <w:rPr>
-                <w:rFonts w:ascii="Times New Roman" w:cs="Times New Roman" w:eastAsia="Times New Roman" w:hAnsi="Times New Roman"/>
-                <w:sz w:val="17"/>
-                <w:szCs w:val="17"/>
-              </w:rPr>
-            </w:pPr>
-            <w:r>
-              <w:rPr>
-                <w:rFonts w:ascii="Times New Roman" w:cs="Times New Roman" w:eastAsia="Times New Roman" w:hAnsi="Times New Roman"/>
-                <w:sz w:val="17"/>
-                <w:szCs w:val="17"/>
-                <w:rtl w:val="0"/>
-              </w:rPr>
-              <w:t xml:space="preserve">DietRx / SpiceRx</w:t>
-            </w:r>
-          </w:p>
-        </w:tc>
-        <w:tc>
-          <w:tcPr>
-            <w:tcBorders>
-              <w:top w:color="000000" w:space="0" w:sz="0" w:val="nil"/>
-              <w:left w:color="000000" w:space="0" w:sz="0" w:val="nil"/>
-              <w:bottom w:color="b7b7b7" w:space="0" w:sz="5" w:val="single"/>
-              <w:right w:color="b7b7b7" w:space="0" w:sz="5" w:val="single"/>
-            </w:tcBorders>
-            <w:tcMar>
-              <w:top w:w="80.0" w:type="dxa"/>
-              <w:left w:w="120.0" w:type="dxa"/>
-              <w:bottom w:w="80.0" w:type="dxa"/>
-              <w:right w:w="120.0" w:type="dxa"/>
-            </w:tcMar>
-            <w:vAlign w:val="top"/>
-          </w:tcPr>
-          <w:p>
-            <w:pPr>
-              <w:spacing w:after="40" w:lineRule="auto"/>
-              <w:rPr>
-                <w:rFonts w:ascii="Times New Roman" w:cs="Times New Roman" w:eastAsia="Times New Roman" w:hAnsi="Times New Roman"/>
-                <w:sz w:val="17"/>
-                <w:szCs w:val="17"/>
-              </w:rPr>
-            </w:pPr>
-            <w:r>
-              <w:rPr>
-                <w:rFonts w:ascii="Times New Roman" w:cs="Times New Roman" w:eastAsia="Times New Roman" w:hAnsi="Times New Roman"/>
-                <w:sz w:val="17"/>
-                <w:szCs w:val="17"/>
-                <w:rtl w:val="0"/>
-              </w:rPr>
-              <w:t xml:space="preserve">Food–disease and spice–disease association evidence, used to score the health-relevance of a candidate recipe for MASLD-relevant outcomes.</w:t>
-            </w:r>
-          </w:p>
-        </w:tc>
-      </w:tr>
-      <w:tr>
-        <w:trPr>
-          <w:cantSplit w:val="0"/>
           <w:trHeight w:val="810" w:hRule="atLeast"/>
           <w:tblHeader w:val="0"/>
         </w:trPr>
@@ -1921,7 +1842,7 @@
                 <w:szCs w:val="17"/>
                 <w:rtl w:val="0"/>
               </w:rPr>
-              <w:t xml:space="preserve">The recipe evaluation methodology itself — multi-criteria scoring and ranking over a food knowledge graph — extends the food-pairing / recipe-recommendation line of work already established in the lab's own literature (§4).</w:t>
+              <w:t>The recipe evaluation methodology itself — multi-criteria scoring and ranking of structured recipe data, linked to an evidence table — extends the food-pairing / recipe-recommendation line of work already established in the lab's own literature (§4).</w:t>
             </w:r>
           </w:p>
         </w:tc>
@@ -2044,7 +1965,7 @@
           <w:rFonts w:ascii="Times New Roman" w:cs="Times New Roman" w:eastAsia="Times New Roman" w:hAnsi="Times New Roman"/>
           <w:rtl w:val="0"/>
         </w:rPr>
-        <w:t xml:space="preserve"> Databases such as DietRx and SpiceRx connect foods and ingredients with reported dietary and health associations. These resources provide valuable evidence that can support personalized dietary decisions. However, they do not by themselves provide a framework for evaluating complete recipes according to a patient's current health state.</w:t>
+        <w:t xml:space="preserve"> Clinical trials, meta-analyses and practice guidelines connect dietary interventions with measured liver outcomes. These resources provide valuable evidence that can support personalized dietary decisions. However, they do not by themselves provide a framework for evaluating complete recipes according to a patient's current health state.</w:t>
       </w:r>
     </w:p>
     <w:p>
@@ -2477,7 +2398,7 @@
           <w:rFonts w:ascii="Times New Roman" w:cs="Times New Roman" w:eastAsia="Times New Roman" w:hAnsi="Times New Roman"/>
           <w:rtl w:val="0"/>
         </w:rPr>
-        <w:t xml:space="preserve">XGBoost main model, compared to logistic regression and random forest baselines</w:t>
+        <w:t>XGBoost main model, compared to linear regression and random forest baselines</w:t>
       </w:r>
     </w:p>
     <w:p>
@@ -2678,7 +2599,7 @@
           <w:rFonts w:ascii="Times New Roman" w:cs="Times New Roman" w:eastAsia="Times New Roman" w:hAnsi="Times New Roman"/>
           <w:rtl w:val="0"/>
         </w:rPr>
-        <w:t xml:space="preserve">Every intervention effect used by the ranking engine is pulled from a named clinical trial or meta-analysis, with an explicit evidence-strength label. Starter rows (target: 10–15 total):</w:t>
+        <w:t>Every intervention effect used by the ranking engine is pulled from a named clinical trial or meta-analysis, with an explicit evidence-strength label. The current table has 17 rows, each with an evidence ID cited by the rules; a selection is shown:</w:t>
       </w:r>
     </w:p>
     <w:tbl>
@@ -4444,6 +4365,38 @@
     </w:p>
     <w:p>
       <w:pPr>
+        <w:spacing w:after="80" w:line="268.8" w:lineRule="auto"/>
+        <w:ind w:left="640" w:hanging="240"/>
+        <w:rPr>
+          <w:rFonts w:ascii="Times New Roman" w:cs="Times New Roman" w:eastAsia="Times New Roman" w:hAnsi="Times New Roman"/>
+        </w:rPr>
+      </w:pPr>
+      <w:r>
+        <w:rPr>
+          <w:rFonts w:ascii="Times New Roman" w:cs="Times New Roman" w:eastAsia="Times New Roman" w:hAnsi="Times New Roman"/>
+          <w:rtl w:val="0"/>
+        </w:rPr>
+        <w:t xml:space="preserve">•</w:t>
+      </w:r>
+      <w:r>
+        <w:rPr>
+          <w:rFonts w:ascii="Times New Roman" w:cs="Times New Roman" w:eastAsia="Times New Roman" w:hAnsi="Times New Roman"/>
+          <w:sz w:val="14"/>
+          <w:szCs w:val="14"/>
+          <w:rtl w:val="0"/>
+        </w:rPr>
+        <w:t xml:space="preserve">     </w:t>
+      </w:r>
+      <w:r>
+        <w:rPr>
+          <w:rFonts w:ascii="Times New Roman" w:cs="Times New Roman" w:eastAsia="Times New Roman" w:hAnsi="Times New Roman"/>
+          <w:rtl w:val="0"/>
+        </w:rPr>
+        <w:t>GUIDELINE RECOMMENDATION — advice from a current clinical practice guideline (EASL-EASD-EASO 2024), used for its direction only and never converted into an effect size</w:t>
+      </w:r>
+    </w:p>
+    <w:p>
+      <w:pPr>
         <w:pStyle w:val="Heading3"/>
         <w:keepNext w:val="0"/>
         <w:keepLines w:val="0"/>
@@ -4788,7 +4741,7 @@
                 <w:szCs w:val="17"/>
                 <w:rtl w:val="0"/>
               </w:rPr>
-              <w:t xml:space="preserve">Layer 3 evidence-graded effect sizes + DietRx/SpiceRx associations</w:t>
+              <w:t>Layer 3 evidence-graded effect sizes from clinical trials, meta-analyses and guidelines</w:t>
             </w:r>
           </w:p>
         </w:tc>
@@ -5135,7 +5088,7 @@
           <w:rFonts w:ascii="Times New Roman" w:cs="Times New Roman" w:eastAsia="Times New Roman" w:hAnsi="Times New Roman"/>
           <w:rtl w:val="0"/>
         </w:rPr>
-        <w:t xml:space="preserve">These criteria are normalized and combined using a transparent multi-criteria scoring framework, initially a weighted scoring approach with weights explicitly defined and reported. The candidate recipes are then ranked according to their overall suitability for the patient, and a sensitivity analysis examines how changes in the criterion weights affect the ranking. The system returns the highest-ranked recipes together with the individual criterion scores so that the recommendation remains interpretable.</w:t>
+        <w:t>These criteria are normalized and combined using a transparent multi-criteria scoring framework with weights explicitly defined and reported (health 0.6, cuisine compatibility 0.2, cooking feasibility 0.2). A health gate is applied by default: recipes that meet every evidence-based nutritional reference are ranked ahead of those that do not, so a high cuisine or feasibility score cannot compensate for a weak health profile. Within each group, recipes are ordered by their overall weighted score, and a sensitivity analysis examines how changes in the criterion weights affect the ranking. The system returns the highest-ranked recipes together with the individual criterion scores so that the recommendation remains interpretable.</w:t>
       </w:r>
     </w:p>
     <w:p>
@@ -5180,7 +5133,7 @@
           <w:rFonts w:ascii="Times New Roman" w:cs="Times New Roman" w:eastAsia="Times New Roman" w:hAnsi="Times New Roman"/>
           <w:rtl w:val="0"/>
         </w:rPr>
-        <w:t xml:space="preserve">Each recommended recipe is validated by working back from the knowledge graph to see the specific DietRx/SpiceRx association and strength of evidence that support it, and the cuisine/process context that kept it appropriate for the patient.</w:t>
+        <w:t>Each recommended recipe is validated by working back through the knowledge graph to the evidence-table rows and strength of evidence that support it, and the cuisine/process context that kept it appropriate for the patient.</w:t>
       </w:r>
     </w:p>
     <w:p>
@@ -5418,7 +5371,7 @@
                 <w:szCs w:val="17"/>
                 <w:rtl w:val="0"/>
               </w:rPr>
-              <w:t xml:space="preserve">Calibrated model probability from Layer 2, e.g. “68% predicted probability of grade ≥S1, 95% CI from calibration curve”</w:t>
+              <w:t>Calibrated model probability from Layer 2, e.g. “68% predicted probability of grade ≥S1, 95% bootstrap interval (§17.4)”</w:t>
             </w:r>
           </w:p>
         </w:tc>
@@ -6350,6 +6303,38 @@
     </w:p>
     <w:p>
       <w:pPr>
+        <w:spacing w:after="80" w:line="268.8" w:lineRule="auto"/>
+        <w:ind w:left="640" w:hanging="240"/>
+        <w:rPr>
+          <w:rFonts w:ascii="Times New Roman" w:cs="Times New Roman" w:eastAsia="Times New Roman" w:hAnsi="Times New Roman"/>
+        </w:rPr>
+      </w:pPr>
+      <w:r>
+        <w:rPr>
+          <w:rFonts w:ascii="Times New Roman" w:cs="Times New Roman" w:eastAsia="Times New Roman" w:hAnsi="Times New Roman"/>
+          <w:rtl w:val="0"/>
+        </w:rPr>
+        <w:t xml:space="preserve">•</w:t>
+      </w:r>
+      <w:r>
+        <w:rPr>
+          <w:rFonts w:ascii="Times New Roman" w:cs="Times New Roman" w:eastAsia="Times New Roman" w:hAnsi="Times New Roman"/>
+          <w:sz w:val="14"/>
+          <w:szCs w:val="14"/>
+          <w:rtl w:val="0"/>
+        </w:rPr>
+        <w:t xml:space="preserve">     </w:t>
+      </w:r>
+      <w:r>
+        <w:rPr>
+          <w:rFonts w:ascii="Times New Roman" w:cs="Times New Roman" w:eastAsia="Times New Roman" w:hAnsi="Times New Roman"/>
+          <w:rtl w:val="0"/>
+        </w:rPr>
+        <w:t>Benchmark against established clinical scores: for CAP ≥ 248 dB/m the calibrated model reached an ROC-AUC of 0.860, compared with 0.842 for the Fatty Liver Index (Bedogni et al., 2006) and 0.813 for the Hepatic Steatosis Index (Lee et al., 2010) on the same test participants (Appendix A).</w:t>
+      </w:r>
+    </w:p>
+    <w:p>
+      <w:pPr>
         <w:pStyle w:val="Heading3"/>
         <w:keepNext w:val="0"/>
         <w:keepLines w:val="0"/>
@@ -6409,7 +6394,7 @@
           <w:szCs w:val="20"/>
           <w:rtl w:val="0"/>
         </w:rPr>
-        <w:t xml:space="preserve">The recipe evaluation and ranking engine will be assessed by measuring the proportion of recommended recipes that satisfy the defined health, cuisine-compatibility, and cooking-feasibility criteria. Its performance will be compared against baseline approaches, including nutrition-only ranking, health-score-only ranking, and random candidate selection.</w:t>
+        <w:t>The ranking engine was evaluated on 300 held-out test patients by the share of top-10 recipes that meet all three criteria: every evidence-based nutritional reference for the patient (energy, saturated fat, sugars and fibre), the patient’s cuisine preference, and practical limits of 60 minutes, 15 ingredients and 12 steps. The default health-gated ranking reached 0.90 (with every recommended recipe meeting the nutritional references), compared with 0.75 for weighted scoring alone, 0.02 for health-score-only and nutrition-only rankings, and 0.003 for random candidate selection. Because NHANES does not record cuisine preferences, these were simulated (Appendix B).</w:t>
       </w:r>
     </w:p>
     <w:p>
@@ -6443,41 +6428,7 @@
           <w:szCs w:val="20"/>
           <w:rtl w:val="0"/>
         </w:rPr>
-        <w:t xml:space="preserve">We measured the proportion of recommended recipes that satisfy the defined cuisine and cooking-feasibility constraints, and compared the proposed multi-criteria ranking against simple baselines such as a nutrition-only ranking, a health-score-only ranking, and random candidate selection.</w:t>
-      </w:r>
-    </w:p>
-    <w:p>
-      <w:pPr>
-        <w:ind w:left="640" w:hanging="240"/>
-        <w:rPr>
-          <w:sz w:val="20"/>
-          <w:szCs w:val="20"/>
-        </w:rPr>
-      </w:pPr>
-      <w:r>
-        <w:rPr>
-          <w:sz w:val="20"/>
-          <w:szCs w:val="20"/>
-          <w:rtl w:val="0"/>
-        </w:rPr>
-        <w:t xml:space="preserve">•</w:t>
-      </w:r>
-      <w:r>
-        <w:rPr>
-          <w:rFonts w:ascii="Times New Roman" w:cs="Times New Roman" w:eastAsia="Times New Roman" w:hAnsi="Times New Roman"/>
-          <w:sz w:val="14"/>
-          <w:szCs w:val="14"/>
-          <w:rtl w:val="0"/>
-        </w:rPr>
-        <w:t xml:space="preserve">     </w:t>
-      </w:r>
-      <w:r>
-        <w:rPr>
-          <w:sz w:val="20"/>
-          <w:szCs w:val="20"/>
-          <w:rtl w:val="0"/>
-        </w:rPr>
-        <w:t xml:space="preserve">We also ran a sensitivity analysis to examine whether the ranking remains reasonably stable when the relative importance of health, cuisine compatibility, and feasibility is changed.</w:t>
+        <w:t>A sensitivity analysis over 36 weight combinations found a median top-10 overlap of 1.0 with the default ranking (mean 0.90); overlap fell below 0.8 mainly when the cuisine weight was reduced to 0.1.</w:t>
       </w:r>
     </w:p>
     <w:p>
@@ -7512,7 +7463,7 @@
                 <w:szCs w:val="17"/>
                 <w:rtl w:val="0"/>
               </w:rPr>
-              <w:t xml:space="preserve">DietRx / SpiceRx</w:t>
+              <w:t xml:space="preserve">USDA FoodData Central / IFCT</w:t>
             </w:r>
           </w:p>
         </w:tc>
@@ -7549,7 +7500,7 @@
                 <w:szCs w:val="17"/>
                 <w:rtl w:val="0"/>
               </w:rPr>
-              <w:t xml:space="preserve">Food/spice–disease association evidence for the health objective</w:t>
+              <w:t xml:space="preserve">Nutrient look-up for recipe-to-nutrient conversion</w:t>
             </w:r>
           </w:p>
         </w:tc>
@@ -7586,7 +7537,7 @@
                 <w:szCs w:val="17"/>
                 <w:rtl w:val="0"/>
               </w:rPr>
-              <w:t xml:space="preserve">—</w:t>
+              <w:t xml:space="preserve">Reference table, not patient data</w:t>
             </w:r>
           </w:p>
         </w:tc>
@@ -7630,7 +7581,7 @@
                 <w:szCs w:val="17"/>
                 <w:rtl w:val="0"/>
               </w:rPr>
-              <w:t xml:space="preserve">USDA FoodData Central / IFCT</w:t>
+              <w:t>NHANES III (1988–1994) hepatic steatosis ultrasound + Linked Mortality Files (proposed, §17.9)</w:t>
             </w:r>
           </w:p>
         </w:tc>
@@ -7667,7 +7618,7 @@
                 <w:szCs w:val="17"/>
                 <w:rtl w:val="0"/>
               </w:rPr>
-              <w:t xml:space="preserve">Nutrient look-up for recipe-to-nutrient conversion</w:t>
+              <w:t>External validation against graded ultrasound; long-term outcome validation</w:t>
             </w:r>
           </w:p>
         </w:tc>
@@ -7704,7 +7655,7 @@
                 <w:szCs w:val="17"/>
                 <w:rtl w:val="0"/>
               </w:rPr>
-              <w:t xml:space="preserve">Reference table, not patient data</w:t>
+              <w:t>Public-use; ultrasound re-read released 2011 (adults 20–74); mortality follow-up to 31 December 2019</w:t>
             </w:r>
           </w:p>
         </w:tc>
@@ -7748,7 +7699,7 @@
                 <w:szCs w:val="17"/>
                 <w:rtl w:val="0"/>
               </w:rPr>
-              <w:t>NHANES III (1988–1994) hepatic steatosis ultrasound + Linked Mortality Files (proposed, §17.9)</w:t>
+              <w:t>NHANES 24-hour dietary recall (DR1TOT, DR1IFF) and USDA FPED 2017–March 2020 (§17.1)</w:t>
             </w:r>
           </w:p>
         </w:tc>
@@ -7785,7 +7736,7 @@
                 <w:szCs w:val="17"/>
                 <w:rtl w:val="0"/>
               </w:rPr>
-              <w:t>External validation against graded ultrasound; long-term outcome validation</w:t>
+              <w:t>Patient’s habitual diet; HEI-2020 diet-quality score</w:t>
             </w:r>
           </w:p>
         </w:tc>
@@ -7822,7 +7773,7 @@
                 <w:szCs w:val="17"/>
                 <w:rtl w:val="0"/>
               </w:rPr>
-              <w:t>Public-use; ultrasound re-read released 2011 (adults 20–74); mortality follow-up to 31 December 2019</w:t>
+              <w:t>DR1TOT already downloaded; DR1IFF from NHANES; FPED from USDA ARS</w:t>
             </w:r>
           </w:p>
         </w:tc>
@@ -7866,7 +7817,7 @@
                 <w:szCs w:val="17"/>
                 <w:rtl w:val="0"/>
               </w:rPr>
-              <w:t>NHANES 24-hour dietary recall (DR1TOT, DR1IFF) and USDA FPED 2017–March 2020 (§17.1)</w:t>
+              <w:t>International GI tables 2021; FoodProX (§17.10–17.11)</w:t>
             </w:r>
           </w:p>
         </w:tc>
@@ -7903,7 +7854,7 @@
                 <w:szCs w:val="17"/>
                 <w:rtl w:val="0"/>
               </w:rPr>
-              <w:t>Patient’s habitual diet; HEI-2020 diet-quality score</w:t>
+              <w:t>Glycaemic load and ultra-processing criteria</w:t>
             </w:r>
           </w:p>
         </w:tc>
@@ -7940,243 +7891,7 @@
                 <w:szCs w:val="17"/>
                 <w:rtl w:val="0"/>
               </w:rPr>
-              <w:t>Already downloaded (DR1TOT); FPED from USDA ARS</w:t>
-            </w:r>
-          </w:p>
-        </w:tc>
-      </w:tr>
-      <w:tr>
-        <w:trPr>
-          <w:cantSplit w:val="0"/>
-          <w:trHeight w:val="615" w:hRule="atLeast"/>
-          <w:tblHeader w:val="0"/>
-        </w:trPr>
-        <w:tc>
-          <w:tcPr>
-            <w:tcBorders>
-              <w:top w:color="000000" w:space="0" w:sz="0" w:val="nil"/>
-              <w:left w:color="b7b7b7" w:space="0" w:sz="5" w:val="single"/>
-              <w:bottom w:color="b7b7b7" w:space="0" w:sz="5" w:val="single"/>
-              <w:right w:color="b7b7b7" w:space="0" w:sz="5" w:val="single"/>
-            </w:tcBorders>
-            <w:shd w:fill="ffffff" w:val="clear"/>
-            <w:tcMar>
-              <w:top w:w="80.0" w:type="dxa"/>
-              <w:left w:w="120.0" w:type="dxa"/>
-              <w:bottom w:w="80.0" w:type="dxa"/>
-              <w:right w:w="120.0" w:type="dxa"/>
-            </w:tcMar>
-            <w:vAlign w:val="top"/>
-          </w:tcPr>
-          <w:p>
-            <w:pPr>
-              <w:spacing w:after="40" w:lineRule="auto"/>
-              <w:rPr>
-                <w:rFonts w:ascii="Times New Roman" w:cs="Times New Roman" w:eastAsia="Times New Roman" w:hAnsi="Times New Roman"/>
-                <w:sz w:val="17"/>
-                <w:szCs w:val="17"/>
-              </w:rPr>
-            </w:pPr>
-            <w:r>
-              <w:rPr>
-                <w:rFonts w:ascii="Times New Roman" w:cs="Times New Roman" w:eastAsia="Times New Roman" w:hAnsi="Times New Roman"/>
-                <w:sz w:val="17"/>
-                <w:szCs w:val="17"/>
-                <w:rtl w:val="0"/>
-              </w:rPr>
-              <w:t>International GI tables 2021; FoodProX (§17.10–17.11)</w:t>
-            </w:r>
-          </w:p>
-        </w:tc>
-        <w:tc>
-          <w:tcPr>
-            <w:tcBorders>
-              <w:top w:color="000000" w:space="0" w:sz="0" w:val="nil"/>
-              <w:left w:color="000000" w:space="0" w:sz="0" w:val="nil"/>
-              <w:bottom w:color="b7b7b7" w:space="0" w:sz="5" w:val="single"/>
-              <w:right w:color="b7b7b7" w:space="0" w:sz="5" w:val="single"/>
-            </w:tcBorders>
-            <w:shd w:fill="ffffff" w:val="clear"/>
-            <w:tcMar>
-              <w:top w:w="80.0" w:type="dxa"/>
-              <w:left w:w="120.0" w:type="dxa"/>
-              <w:bottom w:w="80.0" w:type="dxa"/>
-              <w:right w:w="120.0" w:type="dxa"/>
-            </w:tcMar>
-            <w:vAlign w:val="top"/>
-          </w:tcPr>
-          <w:p>
-            <w:pPr>
-              <w:spacing w:after="40" w:lineRule="auto"/>
-              <w:rPr>
-                <w:rFonts w:ascii="Times New Roman" w:cs="Times New Roman" w:eastAsia="Times New Roman" w:hAnsi="Times New Roman"/>
-                <w:sz w:val="17"/>
-                <w:szCs w:val="17"/>
-              </w:rPr>
-            </w:pPr>
-            <w:r>
-              <w:rPr>
-                <w:rFonts w:ascii="Times New Roman" w:cs="Times New Roman" w:eastAsia="Times New Roman" w:hAnsi="Times New Roman"/>
-                <w:sz w:val="17"/>
-                <w:szCs w:val="17"/>
-                <w:rtl w:val="0"/>
-              </w:rPr>
-              <w:t>Glycaemic load and ultra-processing criteria</w:t>
-            </w:r>
-          </w:p>
-        </w:tc>
-        <w:tc>
-          <w:tcPr>
-            <w:tcBorders>
-              <w:top w:color="000000" w:space="0" w:sz="0" w:val="nil"/>
-              <w:left w:color="000000" w:space="0" w:sz="0" w:val="nil"/>
-              <w:bottom w:color="b7b7b7" w:space="0" w:sz="5" w:val="single"/>
-              <w:right w:color="b7b7b7" w:space="0" w:sz="5" w:val="single"/>
-            </w:tcBorders>
-            <w:shd w:fill="ffffff" w:val="clear"/>
-            <w:tcMar>
-              <w:top w:w="80.0" w:type="dxa"/>
-              <w:left w:w="120.0" w:type="dxa"/>
-              <w:bottom w:w="80.0" w:type="dxa"/>
-              <w:right w:w="120.0" w:type="dxa"/>
-            </w:tcMar>
-            <w:vAlign w:val="top"/>
-          </w:tcPr>
-          <w:p>
-            <w:pPr>
-              <w:spacing w:after="40" w:lineRule="auto"/>
-              <w:rPr>
-                <w:rFonts w:ascii="Times New Roman" w:cs="Times New Roman" w:eastAsia="Times New Roman" w:hAnsi="Times New Roman"/>
-                <w:sz w:val="17"/>
-                <w:szCs w:val="17"/>
-              </w:rPr>
-            </w:pPr>
-            <w:r>
-              <w:rPr>
-                <w:rFonts w:ascii="Times New Roman" w:cs="Times New Roman" w:eastAsia="Times New Roman" w:hAnsi="Times New Roman"/>
-                <w:sz w:val="17"/>
-                <w:szCs w:val="17"/>
-                <w:rtl w:val="0"/>
-              </w:rPr>
               <w:t>Published reference tables and open model; mapped to recipe ingredients</w:t>
-            </w:r>
-          </w:p>
-        </w:tc>
-      </w:tr>
-      <w:tr>
-        <w:trPr>
-          <w:cantSplit w:val="0"/>
-          <w:trHeight w:val="615" w:hRule="atLeast"/>
-          <w:tblHeader w:val="0"/>
-        </w:trPr>
-        <w:tc>
-          <w:tcPr>
-            <w:tcBorders>
-              <w:top w:color="000000" w:space="0" w:sz="0" w:val="nil"/>
-              <w:left w:color="b7b7b7" w:space="0" w:sz="5" w:val="single"/>
-              <w:bottom w:color="b7b7b7" w:space="0" w:sz="5" w:val="single"/>
-              <w:right w:color="b7b7b7" w:space="0" w:sz="5" w:val="single"/>
-            </w:tcBorders>
-            <w:shd w:fill="ffffff" w:val="clear"/>
-            <w:tcMar>
-              <w:top w:w="80.0" w:type="dxa"/>
-              <w:left w:w="120.0" w:type="dxa"/>
-              <w:bottom w:w="80.0" w:type="dxa"/>
-              <w:right w:w="120.0" w:type="dxa"/>
-            </w:tcMar>
-            <w:vAlign w:val="top"/>
-          </w:tcPr>
-          <w:p>
-            <w:pPr>
-              <w:spacing w:after="40" w:lineRule="auto"/>
-              <w:rPr>
-                <w:rFonts w:ascii="Times New Roman" w:cs="Times New Roman" w:eastAsia="Times New Roman" w:hAnsi="Times New Roman"/>
-                <w:sz w:val="17"/>
-                <w:szCs w:val="17"/>
-              </w:rPr>
-            </w:pPr>
-            <w:r>
-              <w:rPr>
-                <w:rFonts w:ascii="Times New Roman" w:cs="Times New Roman" w:eastAsia="Times New Roman" w:hAnsi="Times New Roman"/>
-                <w:sz w:val="17"/>
-                <w:szCs w:val="17"/>
-                <w:rtl w:val="0"/>
-              </w:rPr>
-              <w:t>Food.com recipes and reviews (Majumder et al., 2019) (§17.12)</w:t>
-            </w:r>
-          </w:p>
-        </w:tc>
-        <w:tc>
-          <w:tcPr>
-            <w:tcBorders>
-              <w:top w:color="000000" w:space="0" w:sz="0" w:val="nil"/>
-              <w:left w:color="000000" w:space="0" w:sz="0" w:val="nil"/>
-              <w:bottom w:color="b7b7b7" w:space="0" w:sz="5" w:val="single"/>
-              <w:right w:color="b7b7b7" w:space="0" w:sz="5" w:val="single"/>
-            </w:tcBorders>
-            <w:shd w:fill="ffffff" w:val="clear"/>
-            <w:tcMar>
-              <w:top w:w="80.0" w:type="dxa"/>
-              <w:left w:w="120.0" w:type="dxa"/>
-              <w:bottom w:w="80.0" w:type="dxa"/>
-              <w:right w:w="120.0" w:type="dxa"/>
-            </w:tcMar>
-            <w:vAlign w:val="top"/>
-          </w:tcPr>
-          <w:p>
-            <w:pPr>
-              <w:spacing w:after="40" w:lineRule="auto"/>
-              <w:rPr>
-                <w:rFonts w:ascii="Times New Roman" w:cs="Times New Roman" w:eastAsia="Times New Roman" w:hAnsi="Times New Roman"/>
-                <w:sz w:val="17"/>
-                <w:szCs w:val="17"/>
-              </w:rPr>
-            </w:pPr>
-            <w:r>
-              <w:rPr>
-                <w:rFonts w:ascii="Times New Roman" w:cs="Times New Roman" w:eastAsia="Times New Roman" w:hAnsi="Times New Roman"/>
-                <w:sz w:val="17"/>
-                <w:szCs w:val="17"/>
-                <w:rtl w:val="0"/>
-              </w:rPr>
-              <w:t>Recipe acceptability and preference signal; corpus robustness check</w:t>
-            </w:r>
-          </w:p>
-        </w:tc>
-        <w:tc>
-          <w:tcPr>
-            <w:tcBorders>
-              <w:top w:color="000000" w:space="0" w:sz="0" w:val="nil"/>
-              <w:left w:color="000000" w:space="0" w:sz="0" w:val="nil"/>
-              <w:bottom w:color="b7b7b7" w:space="0" w:sz="5" w:val="single"/>
-              <w:right w:color="b7b7b7" w:space="0" w:sz="5" w:val="single"/>
-            </w:tcBorders>
-            <w:shd w:fill="ffffff" w:val="clear"/>
-            <w:tcMar>
-              <w:top w:w="80.0" w:type="dxa"/>
-              <w:left w:w="120.0" w:type="dxa"/>
-              <w:bottom w:w="80.0" w:type="dxa"/>
-              <w:right w:w="120.0" w:type="dxa"/>
-            </w:tcMar>
-            <w:vAlign w:val="top"/>
-          </w:tcPr>
-          <w:p>
-            <w:pPr>
-              <w:spacing w:after="40" w:lineRule="auto"/>
-              <w:rPr>
-                <w:rFonts w:ascii="Times New Roman" w:cs="Times New Roman" w:eastAsia="Times New Roman" w:hAnsi="Times New Roman"/>
-                <w:sz w:val="17"/>
-                <w:szCs w:val="17"/>
-              </w:rPr>
-            </w:pPr>
-            <w:r>
-              <w:rPr>
-                <w:rFonts w:ascii="Times New Roman" w:cs="Times New Roman" w:eastAsia="Times New Roman" w:hAnsi="Times New Roman"/>
-                <w:sz w:val="17"/>
-                <w:szCs w:val="17"/>
-                <w:rtl w:val="0"/>
-              </w:rPr>
-              <w:t>About 231,000 recipes and 1.1 million reviews; public research dataset</w:t>
             </w:r>
           </w:p>
         </w:tc>
@@ -8295,7 +8010,7 @@
           <w:rFonts w:ascii="Times New Roman" w:cs="Times New Roman" w:eastAsia="Times New Roman" w:hAnsi="Times New Roman"/>
           <w:rtl w:val="0"/>
         </w:rPr>
-        <w:t xml:space="preserve">New scoring approach for the task of evidence-based recipe evaluation and selection (health+cuisine+feasibility), based on a food knowledge graph, which drives the intervention engine of the twin</w:t>
+        <w:t>New scoring approach for the task of evidence-based recipe evaluation and selection (health+cuisine+feasibility), linked to an evidence table and a causal knowledge graph, which drives the intervention engine of the twin</w:t>
       </w:r>
     </w:p>
     <w:p>
@@ -9472,7 +9187,7 @@
                 <w:szCs w:val="17"/>
                 <w:rtl w:val="0"/>
               </w:rPr>
-              <w:t xml:space="preserve">XGBoost, scikit-learn (CalibratedClassifierCV), SHAP</w:t>
+              <w:t>XGBoost, scikit-learn (isotonic calibration on out-of-fold predictions), SHAP values (XGBoost TreeSHAP)</w:t>
             </w:r>
           </w:p>
         </w:tc>
@@ -9551,7 +9266,7 @@
                 <w:szCs w:val="17"/>
                 <w:rtl w:val="0"/>
               </w:rPr>
-              <w:t xml:space="preserve">Python, pandas, NumPy/scikit-learn; transparent weighted multi-criteria scoring with sensitivity analysis on criterion weights</w:t>
+              <w:t>Python, pandas, NumPy/scikit-learn; health-gated, transparent weighted multi-criteria scoring with sensitivity analysis on criterion weights</w:t>
             </w:r>
           </w:p>
         </w:tc>
@@ -9834,7 +9549,7 @@
           <w:rFonts w:ascii="Times New Roman" w:cs="Times New Roman" w:eastAsia="Times New Roman" w:hAnsi="Times New Roman"/>
           <w:rtl w:val="0"/>
         </w:rPr>
-        <w:t>Building and evaluating the first end-to-end version of the twin (October 2026) showed where the design could be strengthened. Extensions 17.1–17.8 use data the project already holds; 17.9–17.13 need further public datasets. Each states the layer it extends; their evaluation is listed in §12.4.</w:t>
+        <w:t>Building and evaluating the first end-to-end version of the twin (October 2026) showed where the design could be strengthened. Extensions 17.1–17.8 use data the project already holds (17.1 also needs the DR1IFF food files and FPED); 17.9–17.13 need further public datasets. Each states the layer it extends; their evaluation is listed in §12.4.</w:t>
       </w:r>
     </w:p>
     <w:tbl>
@@ -10238,7 +9953,7 @@
                 <w:szCs w:val="17"/>
                 <w:rtl w:val="0"/>
               </w:rPr>
-              <w:t>NHANES DR1TOT/DR1IFF (held); FPED</w:t>
+              <w:t>NHANES DR1TOT (held); DR1IFF; FPED</w:t>
             </w:r>
           </w:p>
         </w:tc>
@@ -11022,7 +10737,7 @@
                 <w:szCs w:val="17"/>
                 <w:rtl w:val="0"/>
               </w:rPr>
-              <w:t>Repeat measurements</w:t>
+              <w:t>Measurements entered over time (no new dataset)</w:t>
             </w:r>
           </w:p>
         </w:tc>
@@ -12318,7 +12033,7 @@
                 <w:szCs w:val="17"/>
                 <w:rtl w:val="0"/>
               </w:rPr>
-              <w:t>Acceptability and larger corpora</w:t>
+              <w:t>Acceptability and wider recipe coverage</w:t>
             </w:r>
           </w:p>
         </w:tc>
@@ -12394,7 +12109,7 @@
                 <w:szCs w:val="17"/>
                 <w:rtl w:val="0"/>
               </w:rPr>
-              <w:t>RecipeDB ratings; Food.com; full RecipeDB</w:t>
+              <w:t>RecipeDB ratings; full RecipeDB</w:t>
             </w:r>
           </w:p>
         </w:tc>
@@ -13391,7 +13106,7 @@
           <w:szCs w:val="26"/>
           <w:rtl w:val="0"/>
         </w:rPr>
-        <w:t>17.12 Recipe acceptability and larger corpora (new data)</w:t>
+        <w:t>17.12 Recipe acceptability and wider RecipeDB coverage (new data)</w:t>
       </w:r>
     </w:p>
     <w:p>
@@ -13413,7 +13128,7 @@
           <w:rFonts w:ascii="Times New Roman" w:cs="Times New Roman" w:eastAsia="Times New Roman" w:hAnsi="Times New Roman"/>
           <w:rtl w:val="0"/>
         </w:rPr>
-        <w:t>RecipeDB ratings and rating counts, already parsed, can serve as an acceptability signal. The Food.com dataset (Majumder et al., 2019; about 231,000 recipes and 1.1 million reviews) supports preference modelling and a robustness check of the ranking on a second corpus.</w:t>
+        <w:t>RecipeDB ratings and rating counts, already parsed, can serve as an acceptability signal, so that well-rated recipes are preferred among those with comparable health scores.</w:t>
       </w:r>
     </w:p>
     <w:p>
@@ -13435,7 +13150,7 @@
           <w:rFonts w:ascii="Times New Roman" w:cs="Times New Roman" w:eastAsia="Times New Roman" w:hAnsi="Times New Roman"/>
           <w:rtl w:val="0"/>
         </w:rPr>
-        <w:t>The current 20,000-recipe subset contains only 19 Indian recipes. Drawing on the full RecipeDB, including Indian regional cuisines, would make cuisine compatibility meaningful for Indian users, for whom the Asian BMI thresholds are already implemented.</w:t>
+        <w:t>The current 20,000-recipe subset contains only 19 Indian recipes, and 73% of its recipes have no specific cuisine label (“Other”). Drawing on the full RecipeDB, including Indian regional cuisines, would make cuisine compatibility meaningful for Indian users, for whom the Asian BMI thresholds are already implemented.</w:t>
       </w:r>
     </w:p>
     <w:p>
@@ -13484,6 +13199,50 @@
     </w:p>
     <w:p>
       <w:pPr>
+        <w:pStyle w:val="Heading3"/>
+        <w:keepNext w:val="0"/>
+        <w:keepLines w:val="0"/>
+        <w:spacing w:after="100" w:before="200" w:lineRule="auto"/>
+        <w:rPr>
+          <w:rFonts w:ascii="Times New Roman" w:cs="Times New Roman" w:eastAsia="Times New Roman" w:hAnsi="Times New Roman"/>
+          <w:b w:val="1"/>
+          <w:bCs w:val="1"/>
+          <w:color w:val="000000"/>
+          <w:sz w:val="26"/>
+          <w:szCs w:val="26"/>
+        </w:rPr>
+      </w:pPr>
+      <w:bookmarkStart w:colFirst="0" w:colLast="0" w:name="_xj2xdaf629vx" w:id="21"/>
+      <w:bookmarkEnd w:id="21"/>
+      <w:r>
+        <w:rPr>
+          <w:rFonts w:ascii="Times New Roman" w:cs="Times New Roman" w:eastAsia="Times New Roman" w:hAnsi="Times New Roman"/>
+          <w:b/>
+          <w:bCs w:val="1"/>
+          <w:color w:val="000000"/>
+          <w:sz w:val="26"/>
+          <w:szCs w:val="26"/>
+          <w:rtl w:val="0"/>
+        </w:rPr>
+        <w:t>17.14 Future work</w:t>
+      </w:r>
+    </w:p>
+    <w:p>
+      <w:pPr>
+        <w:rPr>
+          <w:rFonts w:ascii="Times New Roman" w:cs="Times New Roman" w:eastAsia="Times New Roman" w:hAnsi="Times New Roman"/>
+        </w:rPr>
+      </w:pPr>
+      <w:r>
+        <w:rPr>
+          <w:rFonts w:ascii="Times New Roman" w:cs="Times New Roman" w:eastAsia="Times New Roman" w:hAnsi="Times New Roman"/>
+          <w:rtl w:val="0"/>
+        </w:rPr>
+        <w:t>Food–disease and spice–disease association resources such as DietRx and SpiceRx could add an ingredient-level health-relevance signal to the ranking engine. Because these associations are largely literature-mined and observational, they would be kept separate from the graded intervention evidence and labelled as associations rather than effects.</w:t>
+      </w:r>
+    </w:p>
+    <w:p>
+      <w:pPr>
         <w:pStyle w:val="Heading1"/>
         <w:keepNext w:val="0"/>
         <w:keepLines w:val="0"/>
@@ -14377,38 +14136,6 @@
           <w:rtl w:val="0"/>
         </w:rPr>
         <w:t>Atkinson, F.S. et al. (2021). International tables of glycemic index and glycemic load values 2021: a systematic review. American Journal of Clinical Nutrition, 114(5), 1625–1632.</w:t>
-      </w:r>
-    </w:p>
-    <w:p>
-      <w:pPr>
-        <w:spacing w:after="80" w:line="268.8" w:lineRule="auto"/>
-        <w:ind w:left="640" w:hanging="240"/>
-        <w:rPr>
-          <w:rFonts w:ascii="Times New Roman" w:cs="Times New Roman" w:eastAsia="Times New Roman" w:hAnsi="Times New Roman"/>
-        </w:rPr>
-      </w:pPr>
-      <w:r>
-        <w:rPr>
-          <w:rFonts w:ascii="Times New Roman" w:cs="Times New Roman" w:eastAsia="Times New Roman" w:hAnsi="Times New Roman"/>
-          <w:rtl w:val="0"/>
-        </w:rPr>
-        <w:t xml:space="preserve">•</w:t>
-      </w:r>
-      <w:r>
-        <w:rPr>
-          <w:rFonts w:ascii="Times New Roman" w:cs="Times New Roman" w:eastAsia="Times New Roman" w:hAnsi="Times New Roman"/>
-          <w:sz w:val="14"/>
-          <w:szCs w:val="14"/>
-          <w:rtl w:val="0"/>
-        </w:rPr>
-        <w:t xml:space="preserve">     </w:t>
-      </w:r>
-      <w:r>
-        <w:rPr>
-          <w:rFonts w:ascii="Times New Roman" w:cs="Times New Roman" w:eastAsia="Times New Roman" w:hAnsi="Times New Roman"/>
-          <w:rtl w:val="0"/>
-        </w:rPr>
-        <w:t>Majumder, B.P. et al. (2019). Generating personalized recipes from historical user preferences. Proceedings of EMNLP-IJCNLP 2019.</w:t>
       </w:r>
     </w:p>
     <w:p>

</xml_diff>

<commit_message>
Personalise Layer 3 priorities from the 24-hour recall; let priority levels shape the gated ranking
</commit_message>
<xml_diff>
--- a/HepatoTwin-Proposal (5).docx
+++ b/HepatoTwin-Proposal (5).docx
@@ -5088,7 +5088,7 @@
           <w:rFonts w:ascii="Times New Roman" w:cs="Times New Roman" w:eastAsia="Times New Roman" w:hAnsi="Times New Roman"/>
           <w:rtl w:val="0"/>
         </w:rPr>
-        <w:t>These criteria are normalized and combined using a transparent multi-criteria scoring framework with weights explicitly defined and reported (health 0.6, cuisine compatibility 0.2, cooking feasibility 0.2). A health gate is applied by default: recipes that meet every evidence-based nutritional reference are ranked ahead of those that do not, so a high cuisine or feasibility score cannot compensate for a weak health profile. Within each group, recipes are ordered by their overall weighted score, and a sensitivity analysis examines how changes in the criterion weights affect the ranking. The system returns the highest-ranked recipes together with the individual criterion scores so that the recommendation remains interpretable.</w:t>
+        <w:t>These criteria are normalized and combined using a transparent multi-criteria scoring framework with weights explicitly defined and reported (health 0.6, cuisine compatibility 0.2, cooking feasibility 0.2). A health gate is applied by default: recipes that meet every evidence-based nutritional reference are ranked ahead of those that do not, so a high cuisine or feasibility score cannot compensate for a weak health profile. Among recipes that meet every reference, half of the health score reflects how far a recipe goes beyond the references on the patient’s higher-priority criteria, so the patient’s priority levels continue to shape the ranking. Within each group, recipes are ordered by their overall weighted score, and a sensitivity analysis examines how changes in the criterion weights affect the ranking. The system returns the highest-ranked recipes together with the individual criterion scores so that the recommendation remains interpretable.</w:t>
       </w:r>
     </w:p>
     <w:p>
@@ -6394,7 +6394,7 @@
           <w:szCs w:val="20"/>
           <w:rtl w:val="0"/>
         </w:rPr>
-        <w:t>The ranking engine was evaluated on 300 held-out test patients by the share of top-10 recipes that meet all three criteria: every evidence-based nutritional reference for the patient (energy, saturated fat, sugars and fibre), the patient’s cuisine preference, and practical limits of 60 minutes, 15 ingredients and 12 steps. The default health-gated ranking reached 0.90 (with every recommended recipe meeting the nutritional references), compared with 0.75 for weighted scoring alone, 0.02 for health-score-only and nutrition-only rankings, and 0.003 for random candidate selection. Because NHANES does not record cuisine preferences, these were simulated (Appendix B).</w:t>
+        <w:t>The ranking engine was evaluated on 300 held-out test patients by the share of top-10 recipes that meet all three criteria: every evidence-based nutritional reference for the patient (energy, saturated fat, sugars and fibre), the patient’s cuisine preference, and practical limits of 60 minutes, 15 ingredients and 12 steps. The default health-gated ranking reached 0.80, and was the only method whose recommended recipes always met the nutritional references; weighted scoring alone reached 0.75, health-score-only and nutrition-only rankings 0.02, and random candidate selection 0.003. Because NHANES does not record cuisine preferences, these were simulated (Appendix B).</w:t>
       </w:r>
     </w:p>
     <w:p>
@@ -6428,7 +6428,7 @@
           <w:szCs w:val="20"/>
           <w:rtl w:val="0"/>
         </w:rPr>
-        <w:t>A sensitivity analysis over 36 weight combinations found a median top-10 overlap of 1.0 with the default ranking (mean 0.90); overlap fell below 0.8 mainly when the cuisine weight was reduced to 0.1.</w:t>
+        <w:t>A sensitivity analysis over 36 weight combinations found a median top-10 overlap of 0.77 with the default ranking; overlap fell most when the cuisine weight was reduced to 0.1.</w:t>
       </w:r>
     </w:p>
     <w:p>
@@ -12420,7 +12420,7 @@
           <w:rFonts w:ascii="Times New Roman" w:cs="Times New Roman" w:eastAsia="Times New Roman" w:hAnsi="Times New Roman"/>
           <w:rtl w:val="0"/>
         </w:rPr>
-        <w:t>A priority is raised only when the patient’s own intake exceeds the reference value used for recipes (for example, saturated fat above 10% of energy) and lowered when it is already met. This addresses the main limitation found in the ranking evaluation: most patients currently receive the same four priorities. The same data provide the patient’s usual diet for Scenario B (§8) and the “current dietary choices” view of the dashboard (§10).</w:t>
+        <w:t>A priority is raised only when the patient’s own intake exceeds the reference value used for recipes (for example, saturated fat above 10% of energy) and lowered when it is already met. This addresses the main limitation found in the ranking evaluation: most patients received the same priorities. With the recall, 300 test patients had 37 distinct priority profiles instead of 11 and 33 distinct top-10 lists instead of 17, and patients with a higher saturated-fat or sugar priority received recipes lower in that nutrient. The same data provide the patient’s usual diet for Scenario B (§8) and the “current dietary choices” view of the dashboard (§10).</w:t>
       </w:r>
     </w:p>
     <w:p>

</xml_diff>

<commit_message>
Add Layer 5 scenarios, meal plans with cuisine fallback and acceptability; extend evidence table; meeting 9 report
</commit_message>
<xml_diff>
--- a/HepatoTwin-Proposal (5).docx
+++ b/HepatoTwin-Proposal (5).docx
@@ -2599,7 +2599,7 @@
           <w:rFonts w:ascii="Times New Roman" w:cs="Times New Roman" w:eastAsia="Times New Roman" w:hAnsi="Times New Roman"/>
           <w:rtl w:val="0"/>
         </w:rPr>
-        <w:t>Every intervention effect used by the ranking engine is pulled from a named clinical trial or meta-analysis, with an explicit evidence-strength label. The current table has 17 rows, each with an evidence ID cited by the rules; a selection is shown:</w:t>
+        <w:t>Every intervention effect used by the ranking engine is pulled from a named clinical trial or meta-analysis, with an explicit evidence-strength label. The current table has 23 rows, each with an evidence ID cited by the rules; a selection is shown:</w:t>
       </w:r>
     </w:p>
     <w:tbl>
@@ -4397,6 +4397,38 @@
     </w:p>
     <w:p>
       <w:pPr>
+        <w:spacing w:after="80" w:line="268.8" w:lineRule="auto"/>
+        <w:ind w:left="640" w:hanging="240"/>
+        <w:rPr>
+          <w:rFonts w:ascii="Times New Roman" w:cs="Times New Roman" w:eastAsia="Times New Roman" w:hAnsi="Times New Roman"/>
+        </w:rPr>
+      </w:pPr>
+      <w:r>
+        <w:rPr>
+          <w:rFonts w:ascii="Times New Roman" w:cs="Times New Roman" w:eastAsia="Times New Roman" w:hAnsi="Times New Roman"/>
+          <w:rtl w:val="0"/>
+        </w:rPr>
+        <w:t xml:space="preserve">•</w:t>
+      </w:r>
+      <w:r>
+        <w:rPr>
+          <w:rFonts w:ascii="Times New Roman" w:cs="Times New Roman" w:eastAsia="Times New Roman" w:hAnsi="Times New Roman"/>
+          <w:sz w:val="14"/>
+          <w:szCs w:val="14"/>
+          <w:rtl w:val="0"/>
+        </w:rPr>
+        <w:t xml:space="preserve">     </w:t>
+      </w:r>
+      <w:r>
+        <w:rPr>
+          <w:rFonts w:ascii="Times New Roman" w:cs="Times New Roman" w:eastAsia="Times New Roman" w:hAnsi="Times New Roman"/>
+          <w:rtl w:val="0"/>
+        </w:rPr>
+        <w:t>OBSERVATIONAL ASSOCIATION — an association from observational studies (for example, coffee and lower odds of fibrosis); never used to set a priority or score a recipe, and reported as an association rather than an effect</w:t>
+      </w:r>
+    </w:p>
+    <w:p>
+      <w:pPr>
         <w:pStyle w:val="Heading3"/>
         <w:keepNext w:val="0"/>
         <w:keepLines w:val="0"/>
@@ -5088,7 +5120,7 @@
           <w:rFonts w:ascii="Times New Roman" w:cs="Times New Roman" w:eastAsia="Times New Roman" w:hAnsi="Times New Roman"/>
           <w:rtl w:val="0"/>
         </w:rPr>
-        <w:t>These criteria are normalized and combined using a transparent multi-criteria scoring framework with weights explicitly defined and reported (health 0.6, cuisine compatibility 0.2, cooking feasibility 0.2). A health gate is applied by default: recipes that meet every evidence-based nutritional reference are ranked ahead of those that do not, so a high cuisine or feasibility score cannot compensate for a weak health profile. Among recipes that meet every reference, half of the health score reflects how far a recipe goes beyond the references on the patient’s higher-priority criteria, so the patient’s priority levels continue to shape the ranking. Within each group, recipes are ordered by their overall weighted score, and a sensitivity analysis examines how changes in the criterion weights affect the ranking. The system returns the highest-ranked recipes together with the individual criterion scores so that the recommendation remains interpretable.</w:t>
+        <w:t>These criteria are normalized and combined using a transparent multi-criteria scoring framework with weights explicitly defined and reported (health 0.6, cuisine compatibility 0.2, cooking feasibility 0.2, acceptability 0.1, renormalised). Acceptability is the RecipeDB rating shrunk towards the corpus mean by the number of ratings, so recipes many people have rated well are preferred. A health gate is applied by default: recipes that meet every evidence-based nutritional reference are ranked ahead of those that do not, so a high cuisine or feasibility score cannot compensate for a weak health profile. Among recipes that meet every reference, half of the health score reflects how far a recipe goes beyond the references on the patient’s higher-priority criteria, so the patient’s priority levels continue to shape the ranking. Within each group, recipes are ordered by their overall weighted score, and a sensitivity analysis examines how changes in the criterion weights affect the ranking. The system returns the highest-ranked recipes together with the individual criterion scores so that the recommendation remains interpretable.</w:t>
       </w:r>
     </w:p>
     <w:p>
@@ -6394,7 +6426,7 @@
           <w:szCs w:val="20"/>
           <w:rtl w:val="0"/>
         </w:rPr>
-        <w:t>The ranking engine was evaluated on 300 held-out test patients by the share of top-10 recipes that meet all three criteria: every evidence-based nutritional reference for the patient (energy, saturated fat, sugars and fibre), the patient’s cuisine preference, and practical limits of 60 minutes, 15 ingredients and 12 steps. The default health-gated ranking reached 0.80, and was the only method whose recommended recipes always met the nutritional references; weighted scoring alone reached 0.75, health-score-only and nutrition-only rankings 0.02, and random candidate selection 0.003. Because NHANES does not record cuisine preferences, these were simulated (Appendix B).</w:t>
+        <w:t>The ranking engine was evaluated on 300 held-out test patients by the share of top-10 recipes that meet all three criteria: every evidence-based nutritional reference for the patient (energy, saturated fat, sugars and fibre), the patient’s cuisine preference, and practical limits of 60 minutes, 15 ingredients and 12 steps. The default health-gated ranking reached 0.83 (0.80 without acceptability), and was the only method whose recommended recipes always met the nutritional references; weighted scoring alone reached 0.73, health-score-only and nutrition-only rankings 0.02, and random candidate selection 0.003. Because NHANES does not record cuisine preferences, these were simulated (Appendix B).</w:t>
       </w:r>
     </w:p>
     <w:p>
@@ -6428,7 +6460,7 @@
           <w:szCs w:val="20"/>
           <w:rtl w:val="0"/>
         </w:rPr>
-        <w:t>A sensitivity analysis over 36 weight combinations found a median top-10 overlap of 0.77 with the default ranking; overlap fell most when the cuisine weight was reduced to 0.1.</w:t>
+        <w:t>A sensitivity analysis over 36 weight combinations found a median top-10 overlap of 0.79 with the default ranking; overlap fell most when the cuisine weight was reduced to 0.1.</w:t>
       </w:r>
     </w:p>
     <w:p>
@@ -7773,7 +7805,7 @@
                 <w:szCs w:val="17"/>
                 <w:rtl w:val="0"/>
               </w:rPr>
-              <w:t>DR1TOT already downloaded; DR1IFF from NHANES; FPED from USDA ARS</w:t>
+              <w:t>DR1TOT and FPED downloaded; USDA has not released FPED for 2021–2023</w:t>
             </w:r>
           </w:p>
         </w:tc>
@@ -9549,7 +9581,7 @@
           <w:rFonts w:ascii="Times New Roman" w:cs="Times New Roman" w:eastAsia="Times New Roman" w:hAnsi="Times New Roman"/>
           <w:rtl w:val="0"/>
         </w:rPr>
-        <w:t>Building and evaluating the first end-to-end version of the twin (October 2026) showed where the design could be strengthened. Extensions 17.1–17.8 use data the project already holds (17.1 also needs the DR1IFF food files and FPED); 17.9–17.13 need further public datasets. Each states the layer it extends; their evaluation is listed in §12.4.</w:t>
+        <w:t>Building and evaluating the first end-to-end version of the twin (October 2026) showed where the design could be strengthened. Extensions 17.1–17.8 and 17.12 use data the project already holds (17.1 also uses USDA FPED, now downloaded); 17.9–17.11 and 17.13 need further public datasets. Each states the layer it extends; their evaluation is listed in §12.4.</w:t>
       </w:r>
     </w:p>
     <w:tbl>
@@ -9953,7 +9985,7 @@
                 <w:szCs w:val="17"/>
                 <w:rtl w:val="0"/>
               </w:rPr>
-              <w:t>NHANES DR1TOT (held); DR1IFF; FPED</w:t>
+              <w:t>NHANES DR1TOT and USDA FPED (held)</w:t>
             </w:r>
           </w:p>
         </w:tc>
@@ -10971,7 +11003,7 @@
                 <w:szCs w:val="17"/>
                 <w:rtl w:val="0"/>
               </w:rPr>
-              <w:t>Varied, usable recommendations</w:t>
+              <w:t>Varied, usable weekly plans in the patient’s own cuisine</w:t>
             </w:r>
           </w:p>
         </w:tc>
@@ -12033,7 +12065,7 @@
                 <w:szCs w:val="17"/>
                 <w:rtl w:val="0"/>
               </w:rPr>
-              <w:t>Acceptability and wider recipe coverage</w:t>
+              <w:t>Recipe acceptability</w:t>
             </w:r>
           </w:p>
         </w:tc>
@@ -12109,7 +12141,7 @@
                 <w:szCs w:val="17"/>
                 <w:rtl w:val="0"/>
               </w:rPr>
-              <w:t>RecipeDB ratings; full RecipeDB</w:t>
+              <w:t>RecipeDB ratings (held)</w:t>
             </w:r>
           </w:p>
         </w:tc>
@@ -12147,7 +12179,7 @@
                 <w:szCs w:val="17"/>
                 <w:rtl w:val="0"/>
               </w:rPr>
-              <w:t>Recipes people like; Indian and regional cuisines</w:t>
+              <w:t>Recipes people like</w:t>
             </w:r>
           </w:p>
         </w:tc>
@@ -12420,7 +12452,7 @@
           <w:rFonts w:ascii="Times New Roman" w:cs="Times New Roman" w:eastAsia="Times New Roman" w:hAnsi="Times New Roman"/>
           <w:rtl w:val="0"/>
         </w:rPr>
-        <w:t>A priority is raised only when the patient’s own intake exceeds the reference value used for recipes (for example, saturated fat above 10% of energy) and lowered when it is already met. This addresses the main limitation found in the ranking evaluation: most patients received the same priorities. With the recall, 300 test patients had 37 distinct priority profiles instead of 11 and 33 distinct top-10 lists instead of 17, and patients with a higher saturated-fat or sugar priority received recipes lower in that nutrient. The same data provide the patient’s usual diet for Scenario B (§8) and the “current dietary choices” view of the dashboard (§10).</w:t>
+        <w:t>A priority is raised only when the patient’s own intake exceeds the reference value used for recipes (for example, saturated fat above 10% of energy) and lowered when it is already met. This addresses the main limitation found in the ranking evaluation: most patients received the same priorities. With the recall, 300 test patients had 37 distinct priority profiles instead of 11 and 28 distinct top-10 lists instead of 16, and patients with a higher saturated-fat or sugar priority received recipes lower in that nutrient. The same data provide the patient’s usual diet for Scenario B (§8) and the “current dietary choices” view of the dashboard (§10).</w:t>
       </w:r>
     </w:p>
     <w:p>
@@ -12804,7 +12836,7 @@
           <w:rFonts w:ascii="Times New Roman" w:cs="Times New Roman" w:eastAsia="Times New Roman" w:hAnsi="Times New Roman"/>
           <w:rtl w:val="0"/>
         </w:rPr>
-        <w:t>A seven-day plan is selected as a constrained optimisation problem: each day meets the evidence-linked reference values, main ingredients do not repeat, and cuisines can be mixed within the patient’s preferences.</w:t>
+        <w:t>A seven-day plan of two main meals a day is built so that every meal and every day meets the evidence-linked reference values, protein sources vary within each day and across the week, and practical recipes come first. Because a patient may not have the ingredients, tools or taste for another cuisine, the week is filled in steps: the patient’s own cuisine first; then a favourite recipe may repeat, never on consecutive days; and only then recipes from the most similar cuisines by ingredient profile, each labelled as borrowed.</w:t>
       </w:r>
     </w:p>
     <w:p>
@@ -13106,7 +13138,7 @@
           <w:szCs w:val="26"/>
           <w:rtl w:val="0"/>
         </w:rPr>
-        <w:t>17.12 Recipe acceptability and wider RecipeDB coverage (new data)</w:t>
+        <w:t>17.12 Recipe acceptability</w:t>
       </w:r>
     </w:p>
     <w:p>
@@ -13129,28 +13161,6 @@
           <w:rtl w:val="0"/>
         </w:rPr>
         <w:t>RecipeDB ratings and rating counts, already parsed, can serve as an acceptability signal, so that well-rated recipes are preferred among those with comparable health scores.</w:t>
-      </w:r>
-    </w:p>
-    <w:p>
-      <w:pPr>
-        <w:rPr>
-          <w:rFonts w:ascii="Times New Roman" w:cs="Times New Roman" w:eastAsia="Times New Roman" w:hAnsi="Times New Roman"/>
-        </w:rPr>
-      </w:pPr>
-      <w:r>
-        <w:rPr>
-          <w:rFonts w:ascii="Times New Roman" w:cs="Times New Roman" w:eastAsia="Times New Roman" w:hAnsi="Times New Roman"/>
-          <w:b/>
-          <w:rtl w:val="0"/>
-        </w:rPr>
-        <w:t xml:space="preserve">Regional cuisines. </w:t>
-      </w:r>
-      <w:r>
-        <w:rPr>
-          <w:rFonts w:ascii="Times New Roman" w:cs="Times New Roman" w:eastAsia="Times New Roman" w:hAnsi="Times New Roman"/>
-          <w:rtl w:val="0"/>
-        </w:rPr>
-        <w:t>The current 20,000-recipe subset contains only 19 Indian recipes, and 73% of its recipes have no specific cuisine label (“Other”). Drawing on the full RecipeDB, including Indian regional cuisines, would make cuisine compatibility meaningful for Indian users, for whom the Asian BMI thresholds are already implemented.</w:t>
       </w:r>
     </w:p>
     <w:p>
@@ -13239,6 +13249,20 @@
           <w:rtl w:val="0"/>
         </w:rPr>
         <w:t>Food–disease and spice–disease association resources such as DietRx and SpiceRx could add an ingredient-level health-relevance signal to the ranking engine. Because these associations are largely literature-mined and observational, they would be kept separate from the graded intervention evidence and labelled as associations rather than effects.</w:t>
+      </w:r>
+    </w:p>
+    <w:p>
+      <w:pPr>
+        <w:rPr>
+          <w:rFonts w:ascii="Times New Roman" w:cs="Times New Roman" w:eastAsia="Times New Roman" w:hAnsi="Times New Roman"/>
+        </w:rPr>
+      </w:pPr>
+      <w:r>
+        <w:rPr>
+          <w:rFonts w:ascii="Times New Roman" w:cs="Times New Roman" w:eastAsia="Times New Roman" w:hAnsi="Times New Roman"/>
+          <w:rtl w:val="0"/>
+        </w:rPr>
+        <w:t>The patient cohort is drawn from the US population, so the recipe corpus focuses on the cuisines eaten there. The 20,000 RecipeDB recipes available to the project include only 19 Indian recipes; access to the full RecipeDB, including Indian regional cuisines, would allow the twin to be validated for Indian users, for whom the Asian BMI thresholds are already implemented.</w:t>
       </w:r>
     </w:p>
     <w:p>

</xml_diff>

<commit_message>
Derive FPED for 2021-2023 from individual foods and validate against USDA totals
</commit_message>
<xml_diff>
--- a/HepatoTwin-Proposal (5).docx
+++ b/HepatoTwin-Proposal (5).docx
@@ -6460,7 +6460,7 @@
           <w:szCs w:val="20"/>
           <w:rtl w:val="0"/>
         </w:rPr>
-        <w:t>A sensitivity analysis over 36 weight combinations found a median top-10 overlap of 0.79 with the default ranking; overlap fell most when the cuisine weight was reduced to 0.1.</w:t>
+        <w:t>A sensitivity analysis over 36 weight combinations found a median top-10 overlap of 0.78 with the default ranking; overlap fell most when the cuisine weight was reduced to 0.1.</w:t>
       </w:r>
     </w:p>
     <w:p>
@@ -7805,7 +7805,7 @@
                 <w:szCs w:val="17"/>
                 <w:rtl w:val="0"/>
               </w:rPr>
-              <w:t>DR1TOT and FPED downloaded; USDA has not released FPED for 2021–2023</w:t>
+              <w:t>Downloaded; FPED for 2021–2023 derived from DR1IFF with the 2017–2020 food-level FPED and validated against USDA totals</w:t>
             </w:r>
           </w:p>
         </w:tc>
@@ -9985,7 +9985,7 @@
                 <w:szCs w:val="17"/>
                 <w:rtl w:val="0"/>
               </w:rPr>
-              <w:t>NHANES DR1TOT and USDA FPED (held)</w:t>
+              <w:t>NHANES DR1TOT, DR1IFF and USDA FPED (held)</w:t>
             </w:r>
           </w:p>
         </w:tc>
@@ -12430,7 +12430,7 @@
           <w:rFonts w:ascii="Times New Roman" w:cs="Times New Roman" w:eastAsia="Times New Roman" w:hAnsi="Times New Roman"/>
           <w:rtl w:val="0"/>
         </w:rPr>
-        <w:t>NHANES records each participant’s intake on the day before the examination (DR1TOT nutrient totals and DR1IFF individual foods with FNDDS codes), in both FibroScan cycles. The USDA Food Patterns Equivalents Database for 2017–March 2020 allows a Healthy Eating Index-2020 score (Shams-White et al., 2023).</w:t>
+        <w:t>NHANES records each participant’s intake on the day before the examination (DR1TOT nutrient totals and DR1IFF individual foods with FNDDS codes), in both FibroScan cycles. The USDA Food Patterns Equivalents Database (FPED) gives added sugars and the food groups for a Healthy Eating Index-2020 score (Shams-White et al., 2023). USDA has released FPED only for 2017–March 2020, so for 2021–2023 the totals are derived with USDA’s method from the individual foods and the 2017–2020 food-level FPED; applied to 2017–2020, this reproduced USDA’s totals (r = 1.00 for added sugars and HEI-2020).</w:t>
       </w:r>
     </w:p>
     <w:p>
@@ -12452,7 +12452,7 @@
           <w:rFonts w:ascii="Times New Roman" w:cs="Times New Roman" w:eastAsia="Times New Roman" w:hAnsi="Times New Roman"/>
           <w:rtl w:val="0"/>
         </w:rPr>
-        <w:t>A priority is raised only when the patient’s own intake exceeds the reference value used for recipes (for example, saturated fat above 10% of energy) and lowered when it is already met. This addresses the main limitation found in the ranking evaluation: most patients received the same priorities. With the recall, 300 test patients had 37 distinct priority profiles instead of 11 and 28 distinct top-10 lists instead of 16, and patients with a higher saturated-fat or sugar priority received recipes lower in that nutrient. The same data provide the patient’s usual diet for Scenario B (§8) and the “current dietary choices” view of the dashboard (§10).</w:t>
+        <w:t>A priority is raised only when the patient’s own intake exceeds the reference value used for recipes (for example, saturated fat above 10% of energy) and lowered when it is already met. This addresses the main limitation found in the ranking evaluation: most patients received the same priorities. With the recall, 300 test patients had 35 distinct priority profiles instead of 11 and 29 distinct top-10 lists instead of 16, and patients with a higher saturated-fat or sugar priority received recipes lower in that nutrient. The same data provide the patient’s usual diet for Scenario B (§8) and the “current dietary choices” view of the dashboard (§10).</w:t>
       </w:r>
     </w:p>
     <w:p>

</xml_diff>